<commit_message>
Retire the pre-v2 codebase into legacy/ and refresh the architecture docs
Assets/, Games/, Main_screen/, Results/ and the loose tag_*.png marker
images move to legacy/ - 260+ files nothing references (project.godot,
app/ and v2/ are all clean of them; Results/ untouched since 2025-10).
A .gdignore there stops the Godot editor importing any of it, which
should also ease editor load on the Pi.

design.md section 6 rewritten: it still described v2/ as the active code
and listed 5 autoloads - now documents app/ (7 autoloads, platform/games/
ui/installer split) plus tools/. Git recorded every move as a rename, so
git log --follow still works across it.

Co-Authored-By: Claude Opus 5 <noreply@anthropic.com>
</commit_message>
<xml_diff>
--- a/pyscripts/markers.docx
+++ b/pyscripts/markers.docx
@@ -8,18 +8,18 @@
           <w:noProof/>
         </w:rPr>
         <w:drawing>
-          <wp:anchor distT="0" distB="0" distL="114300" distR="114300" simplePos="0" relativeHeight="251660288" behindDoc="0" locked="0" layoutInCell="1" allowOverlap="1" wp14:anchorId="27B18FF7" wp14:editId="0193FBD7">
+          <wp:anchor distT="0" distB="0" distL="114300" distR="114300" simplePos="0" relativeHeight="251673600" behindDoc="0" locked="0" layoutInCell="1" allowOverlap="1" wp14:anchorId="15A48CEC" wp14:editId="002554EB">
             <wp:simplePos x="0" y="0"/>
             <wp:positionH relativeFrom="column">
-              <wp:posOffset>3728402</wp:posOffset>
+              <wp:posOffset>4548188</wp:posOffset>
             </wp:positionH>
             <wp:positionV relativeFrom="paragraph">
-              <wp:posOffset>3005138</wp:posOffset>
+              <wp:posOffset>7600632</wp:posOffset>
             </wp:positionV>
-            <wp:extent cx="1799590" cy="1799590"/>
+            <wp:extent cx="1800000" cy="1800000"/>
             <wp:effectExtent l="0" t="0" r="0" b="0"/>
             <wp:wrapNone/>
-            <wp:docPr id="1347578689" name="Picture 3" descr="i&#10;&#10;AI-generated content may be incorrect."/>
+            <wp:docPr id="825462789" name="Picture 1" descr="F&#10;&#10;AI-generated content may be incorrect."/>
             <wp:cNvGraphicFramePr>
               <a:graphicFrameLocks xmlns:a="http://schemas.openxmlformats.org/drawingml/2006/main" noChangeAspect="1"/>
             </wp:cNvGraphicFramePr>
@@ -27,17 +27,11 @@
               <a:graphicData uri="http://schemas.openxmlformats.org/drawingml/2006/picture">
                 <pic:pic xmlns:pic="http://schemas.openxmlformats.org/drawingml/2006/picture">
                   <pic:nvPicPr>
-                    <pic:cNvPr id="1347578689" name="Picture 3" descr="i&#10;&#10;AI-generated content may be incorrect."/>
+                    <pic:cNvPr id="1936521166" name="Picture 1" descr="F&#10;&#10;AI-generated content may be incorrect."/>
                     <pic:cNvPicPr/>
                   </pic:nvPicPr>
                   <pic:blipFill>
-                    <a:blip r:embed="rId4">
-                      <a:extLst>
-                        <a:ext uri="{28A0092B-C50C-407E-A947-70E740481C1C}">
-                          <a14:useLocalDpi xmlns:a14="http://schemas.microsoft.com/office/drawing/2010/main" val="0"/>
-                        </a:ext>
-                      </a:extLst>
-                    </a:blip>
+                    <a:blip r:embed="rId4"/>
                     <a:stretch>
                       <a:fillRect/>
                     </a:stretch>
@@ -45,7 +39,7 @@
                   <pic:spPr>
                     <a:xfrm>
                       <a:off x="0" y="0"/>
-                      <a:ext cx="1799590" cy="1799590"/>
+                      <a:ext cx="1800000" cy="1800000"/>
                     </a:xfrm>
                     <a:prstGeom prst="rect">
                       <a:avLst/>
@@ -68,18 +62,18 @@
           <w:noProof/>
         </w:rPr>
         <w:drawing>
-          <wp:anchor distT="0" distB="0" distL="114300" distR="114300" simplePos="0" relativeHeight="251661312" behindDoc="0" locked="0" layoutInCell="1" allowOverlap="1" wp14:anchorId="1DB10A86" wp14:editId="22EFFA57">
+          <wp:anchor distT="0" distB="0" distL="114300" distR="114300" simplePos="0" relativeHeight="251671552" behindDoc="0" locked="0" layoutInCell="1" allowOverlap="1" wp14:anchorId="654CB361" wp14:editId="051412E0">
             <wp:simplePos x="0" y="0"/>
             <wp:positionH relativeFrom="column">
-              <wp:posOffset>252412</wp:posOffset>
+              <wp:posOffset>2219325</wp:posOffset>
             </wp:positionH>
             <wp:positionV relativeFrom="paragraph">
-              <wp:posOffset>3028632</wp:posOffset>
+              <wp:posOffset>7538720</wp:posOffset>
             </wp:positionV>
-            <wp:extent cx="1799590" cy="1799590"/>
+            <wp:extent cx="1800000" cy="1800000"/>
             <wp:effectExtent l="0" t="0" r="0" b="0"/>
             <wp:wrapNone/>
-            <wp:docPr id="488119219" name="Picture 2" descr="The image appears to be a black and white pattern with a series of geometric shapes or pixels that may suggest a digital or abstract design.&#10;&#10;AI-generated content may be incorrect."/>
+            <wp:docPr id="407334905" name="Picture 1" descr="F&#10;&#10;AI-generated content may be incorrect."/>
             <wp:cNvGraphicFramePr>
               <a:graphicFrameLocks xmlns:a="http://schemas.openxmlformats.org/drawingml/2006/main" noChangeAspect="1"/>
             </wp:cNvGraphicFramePr>
@@ -87,7 +81,61 @@
               <a:graphicData uri="http://schemas.openxmlformats.org/drawingml/2006/picture">
                 <pic:pic xmlns:pic="http://schemas.openxmlformats.org/drawingml/2006/picture">
                   <pic:nvPicPr>
-                    <pic:cNvPr id="488119219" name="Picture 2" descr="The image appears to be a black and white pattern with a series of geometric shapes or pixels that may suggest a digital or abstract design.&#10;&#10;AI-generated content may be incorrect."/>
+                    <pic:cNvPr id="1936521166" name="Picture 1" descr="F&#10;&#10;AI-generated content may be incorrect."/>
+                    <pic:cNvPicPr/>
+                  </pic:nvPicPr>
+                  <pic:blipFill>
+                    <a:blip r:embed="rId4"/>
+                    <a:stretch>
+                      <a:fillRect/>
+                    </a:stretch>
+                  </pic:blipFill>
+                  <pic:spPr>
+                    <a:xfrm>
+                      <a:off x="0" y="0"/>
+                      <a:ext cx="1800000" cy="1800000"/>
+                    </a:xfrm>
+                    <a:prstGeom prst="rect">
+                      <a:avLst/>
+                    </a:prstGeom>
+                  </pic:spPr>
+                </pic:pic>
+              </a:graphicData>
+            </a:graphic>
+            <wp14:sizeRelH relativeFrom="page">
+              <wp14:pctWidth>0</wp14:pctWidth>
+            </wp14:sizeRelH>
+            <wp14:sizeRelV relativeFrom="page">
+              <wp14:pctHeight>0</wp14:pctHeight>
+            </wp14:sizeRelV>
+          </wp:anchor>
+        </w:drawing>
+      </w:r>
+      <w:r>
+        <w:rPr>
+          <w:noProof/>
+        </w:rPr>
+        <w:drawing>
+          <wp:anchor distT="0" distB="0" distL="114300" distR="114300" simplePos="0" relativeHeight="251669504" behindDoc="0" locked="0" layoutInCell="1" allowOverlap="1" wp14:anchorId="6960DD57" wp14:editId="7148CD35">
+            <wp:simplePos x="0" y="0"/>
+            <wp:positionH relativeFrom="column">
+              <wp:posOffset>-305117</wp:posOffset>
+            </wp:positionH>
+            <wp:positionV relativeFrom="paragraph">
+              <wp:posOffset>7548245</wp:posOffset>
+            </wp:positionV>
+            <wp:extent cx="1799590" cy="1799590"/>
+            <wp:effectExtent l="0" t="0" r="0" b="0"/>
+            <wp:wrapNone/>
+            <wp:docPr id="28244017" name="Picture 5" descr="The image shows a black and white patterned background with a simple, abstract geometric design featuring black and white blocks and lines.&#10;&#10;AI-generated content may be incorrect."/>
+            <wp:cNvGraphicFramePr>
+              <a:graphicFrameLocks xmlns:a="http://schemas.openxmlformats.org/drawingml/2006/main" noChangeAspect="1"/>
+            </wp:cNvGraphicFramePr>
+            <a:graphic xmlns:a="http://schemas.openxmlformats.org/drawingml/2006/main">
+              <a:graphicData uri="http://schemas.openxmlformats.org/drawingml/2006/picture">
+                <pic:pic xmlns:pic="http://schemas.openxmlformats.org/drawingml/2006/picture">
+                  <pic:nvPicPr>
+                    <pic:cNvPr id="1620741190" name="Picture 5" descr="The image shows a black and white patterned background with a simple, abstract geometric design featuring black and white blocks and lines.&#10;&#10;AI-generated content may be incorrect."/>
                     <pic:cNvPicPr/>
                   </pic:nvPicPr>
                   <pic:blipFill>
@@ -128,18 +176,18 @@
           <w:noProof/>
         </w:rPr>
         <w:drawing>
-          <wp:anchor distT="0" distB="0" distL="114300" distR="114300" simplePos="0" relativeHeight="251662336" behindDoc="0" locked="0" layoutInCell="1" allowOverlap="1" wp14:anchorId="0F6F0981" wp14:editId="6D46E206">
+          <wp:anchor distT="0" distB="0" distL="114300" distR="114300" simplePos="0" relativeHeight="251667456" behindDoc="0" locked="0" layoutInCell="1" allowOverlap="1" wp14:anchorId="57767822" wp14:editId="0F950A53">
             <wp:simplePos x="0" y="0"/>
             <wp:positionH relativeFrom="column">
-              <wp:posOffset>300038</wp:posOffset>
+              <wp:posOffset>4510087</wp:posOffset>
             </wp:positionH>
             <wp:positionV relativeFrom="paragraph">
-              <wp:posOffset>61913</wp:posOffset>
+              <wp:posOffset>5138420</wp:posOffset>
             </wp:positionV>
             <wp:extent cx="1799590" cy="1799590"/>
             <wp:effectExtent l="0" t="0" r="0" b="0"/>
             <wp:wrapNone/>
-            <wp:docPr id="1710969230" name="Picture 1" descr="The image depicts a stark, minimalistic design with black and white geometric shapes arranged in a fragmented, abstract pattern.&#10;&#10;AI-generated content may be incorrect."/>
+            <wp:docPr id="554520016" name="Picture 5" descr="The image shows a black and white patterned background with a simple, abstract geometric design featuring black and white blocks and lines.&#10;&#10;AI-generated content may be incorrect."/>
             <wp:cNvGraphicFramePr>
               <a:graphicFrameLocks xmlns:a="http://schemas.openxmlformats.org/drawingml/2006/main" noChangeAspect="1"/>
             </wp:cNvGraphicFramePr>
@@ -147,11 +195,11 @@
               <a:graphicData uri="http://schemas.openxmlformats.org/drawingml/2006/picture">
                 <pic:pic xmlns:pic="http://schemas.openxmlformats.org/drawingml/2006/picture">
                   <pic:nvPicPr>
-                    <pic:cNvPr id="1710969230" name="Picture 1" descr="The image depicts a stark, minimalistic design with black and white geometric shapes arranged in a fragmented, abstract pattern.&#10;&#10;AI-generated content may be incorrect."/>
+                    <pic:cNvPr id="1620741190" name="Picture 5" descr="The image shows a black and white patterned background with a simple, abstract geometric design featuring black and white blocks and lines.&#10;&#10;AI-generated content may be incorrect."/>
                     <pic:cNvPicPr/>
                   </pic:nvPicPr>
                   <pic:blipFill>
-                    <a:blip r:embed="rId6">
+                    <a:blip r:embed="rId5">
                       <a:extLst>
                         <a:ext uri="{28A0092B-C50C-407E-A947-70E740481C1C}">
                           <a14:useLocalDpi xmlns:a14="http://schemas.microsoft.com/office/drawing/2010/main" val="0"/>
@@ -188,18 +236,18 @@
           <w:noProof/>
         </w:rPr>
         <w:drawing>
-          <wp:anchor distT="0" distB="0" distL="114300" distR="114300" simplePos="0" relativeHeight="251659264" behindDoc="0" locked="0" layoutInCell="1" allowOverlap="1" wp14:anchorId="70C24CCD" wp14:editId="2503A2DA">
+          <wp:anchor distT="0" distB="0" distL="114300" distR="114300" simplePos="0" relativeHeight="251663360" behindDoc="0" locked="0" layoutInCell="1" allowOverlap="1" wp14:anchorId="618C7B7B" wp14:editId="0AF10FBE">
             <wp:simplePos x="0" y="0"/>
             <wp:positionH relativeFrom="column">
-              <wp:posOffset>300037</wp:posOffset>
+              <wp:posOffset>4590732</wp:posOffset>
             </wp:positionH>
             <wp:positionV relativeFrom="paragraph">
-              <wp:posOffset>6314757</wp:posOffset>
+              <wp:posOffset>2323782</wp:posOffset>
             </wp:positionV>
-            <wp:extent cx="1799590" cy="1799590"/>
+            <wp:extent cx="1800000" cy="1800000"/>
             <wp:effectExtent l="0" t="0" r="0" b="0"/>
             <wp:wrapNone/>
-            <wp:docPr id="1782883457" name="Picture 4" descr="The image is a black and white pattern with a simple, pixelated, checkered design.&#10;&#10;AI-generated content may be incorrect."/>
+            <wp:docPr id="1936521166" name="Picture 1" descr="F&#10;&#10;AI-generated content may be incorrect."/>
             <wp:cNvGraphicFramePr>
               <a:graphicFrameLocks xmlns:a="http://schemas.openxmlformats.org/drawingml/2006/main" noChangeAspect="1"/>
             </wp:cNvGraphicFramePr>
@@ -207,11 +255,173 @@
               <a:graphicData uri="http://schemas.openxmlformats.org/drawingml/2006/picture">
                 <pic:pic xmlns:pic="http://schemas.openxmlformats.org/drawingml/2006/picture">
                   <pic:nvPicPr>
-                    <pic:cNvPr id="1782883457" name="Picture 4" descr="The image is a black and white pattern with a simple, pixelated, checkered design.&#10;&#10;AI-generated content may be incorrect."/>
+                    <pic:cNvPr id="1936521166" name="Picture 1" descr="F&#10;&#10;AI-generated content may be incorrect."/>
                     <pic:cNvPicPr/>
                   </pic:nvPicPr>
                   <pic:blipFill>
-                    <a:blip r:embed="rId7">
+                    <a:blip r:embed="rId4"/>
+                    <a:stretch>
+                      <a:fillRect/>
+                    </a:stretch>
+                  </pic:blipFill>
+                  <pic:spPr>
+                    <a:xfrm>
+                      <a:off x="0" y="0"/>
+                      <a:ext cx="1800000" cy="1800000"/>
+                    </a:xfrm>
+                    <a:prstGeom prst="rect">
+                      <a:avLst/>
+                    </a:prstGeom>
+                  </pic:spPr>
+                </pic:pic>
+              </a:graphicData>
+            </a:graphic>
+            <wp14:sizeRelH relativeFrom="page">
+              <wp14:pctWidth>0</wp14:pctWidth>
+            </wp14:sizeRelH>
+            <wp14:sizeRelV relativeFrom="page">
+              <wp14:pctHeight>0</wp14:pctHeight>
+            </wp14:sizeRelV>
+          </wp:anchor>
+        </w:drawing>
+      </w:r>
+      <w:r>
+        <w:rPr>
+          <w:noProof/>
+        </w:rPr>
+        <w:drawing>
+          <wp:anchor distT="0" distB="0" distL="114300" distR="114300" simplePos="0" relativeHeight="251665408" behindDoc="0" locked="0" layoutInCell="1" allowOverlap="1" wp14:anchorId="004C9B95" wp14:editId="0466B2D6">
+            <wp:simplePos x="0" y="0"/>
+            <wp:positionH relativeFrom="column">
+              <wp:posOffset>2119313</wp:posOffset>
+            </wp:positionH>
+            <wp:positionV relativeFrom="paragraph">
+              <wp:posOffset>5124133</wp:posOffset>
+            </wp:positionV>
+            <wp:extent cx="1800000" cy="1800000"/>
+            <wp:effectExtent l="0" t="0" r="0" b="0"/>
+            <wp:wrapNone/>
+            <wp:docPr id="303302034" name="Picture 3" descr="The image depicts a simple, abstract geometric pattern with intersecting lines and white shapes.&#10;&#10;AI-generated content may be incorrect."/>
+            <wp:cNvGraphicFramePr>
+              <a:graphicFrameLocks xmlns:a="http://schemas.openxmlformats.org/drawingml/2006/main" noChangeAspect="1"/>
+            </wp:cNvGraphicFramePr>
+            <a:graphic xmlns:a="http://schemas.openxmlformats.org/drawingml/2006/main">
+              <a:graphicData uri="http://schemas.openxmlformats.org/drawingml/2006/picture">
+                <pic:pic xmlns:pic="http://schemas.openxmlformats.org/drawingml/2006/picture">
+                  <pic:nvPicPr>
+                    <pic:cNvPr id="303302034" name="Picture 3" descr="The image depicts a simple, abstract geometric pattern with intersecting lines and white shapes.&#10;&#10;AI-generated content may be incorrect."/>
+                    <pic:cNvPicPr/>
+                  </pic:nvPicPr>
+                  <pic:blipFill>
+                    <a:blip r:embed="rId6"/>
+                    <a:stretch>
+                      <a:fillRect/>
+                    </a:stretch>
+                  </pic:blipFill>
+                  <pic:spPr>
+                    <a:xfrm>
+                      <a:off x="0" y="0"/>
+                      <a:ext cx="1800000" cy="1800000"/>
+                    </a:xfrm>
+                    <a:prstGeom prst="rect">
+                      <a:avLst/>
+                    </a:prstGeom>
+                  </pic:spPr>
+                </pic:pic>
+              </a:graphicData>
+            </a:graphic>
+            <wp14:sizeRelH relativeFrom="page">
+              <wp14:pctWidth>0</wp14:pctWidth>
+            </wp14:sizeRelH>
+            <wp14:sizeRelV relativeFrom="page">
+              <wp14:pctHeight>0</wp14:pctHeight>
+            </wp14:sizeRelV>
+          </wp:anchor>
+        </w:drawing>
+      </w:r>
+      <w:r>
+        <w:rPr>
+          <w:noProof/>
+        </w:rPr>
+        <w:drawing>
+          <wp:anchor distT="0" distB="0" distL="114300" distR="114300" simplePos="0" relativeHeight="251664384" behindDoc="0" locked="0" layoutInCell="1" allowOverlap="1" wp14:anchorId="08BC9B04" wp14:editId="0C89B4CC">
+            <wp:simplePos x="0" y="0"/>
+            <wp:positionH relativeFrom="column">
+              <wp:posOffset>-352425</wp:posOffset>
+            </wp:positionH>
+            <wp:positionV relativeFrom="paragraph">
+              <wp:posOffset>5181600</wp:posOffset>
+            </wp:positionV>
+            <wp:extent cx="1800000" cy="1800000"/>
+            <wp:effectExtent l="0" t="0" r="0" b="0"/>
+            <wp:wrapNone/>
+            <wp:docPr id="630145519" name="Picture 2"/>
+            <wp:cNvGraphicFramePr>
+              <a:graphicFrameLocks xmlns:a="http://schemas.openxmlformats.org/drawingml/2006/main" noChangeAspect="1"/>
+            </wp:cNvGraphicFramePr>
+            <a:graphic xmlns:a="http://schemas.openxmlformats.org/drawingml/2006/main">
+              <a:graphicData uri="http://schemas.openxmlformats.org/drawingml/2006/picture">
+                <pic:pic xmlns:pic="http://schemas.openxmlformats.org/drawingml/2006/picture">
+                  <pic:nvPicPr>
+                    <pic:cNvPr id="630145519" name="Picture 2"/>
+                    <pic:cNvPicPr/>
+                  </pic:nvPicPr>
+                  <pic:blipFill>
+                    <a:blip r:embed="rId7"/>
+                    <a:stretch>
+                      <a:fillRect/>
+                    </a:stretch>
+                  </pic:blipFill>
+                  <pic:spPr>
+                    <a:xfrm>
+                      <a:off x="0" y="0"/>
+                      <a:ext cx="1800000" cy="1800000"/>
+                    </a:xfrm>
+                    <a:prstGeom prst="rect">
+                      <a:avLst/>
+                    </a:prstGeom>
+                  </pic:spPr>
+                </pic:pic>
+              </a:graphicData>
+            </a:graphic>
+            <wp14:sizeRelH relativeFrom="page">
+              <wp14:pctWidth>0</wp14:pctWidth>
+            </wp14:sizeRelH>
+            <wp14:sizeRelV relativeFrom="page">
+              <wp14:pctHeight>0</wp14:pctHeight>
+            </wp14:sizeRelV>
+          </wp:anchor>
+        </w:drawing>
+      </w:r>
+      <w:r>
+        <w:rPr>
+          <w:noProof/>
+        </w:rPr>
+        <w:drawing>
+          <wp:anchor distT="0" distB="0" distL="114300" distR="114300" simplePos="0" relativeHeight="251658240" behindDoc="0" locked="0" layoutInCell="1" allowOverlap="1" wp14:anchorId="45D0C538" wp14:editId="6F975DA9">
+            <wp:simplePos x="0" y="0"/>
+            <wp:positionH relativeFrom="column">
+              <wp:posOffset>2047240</wp:posOffset>
+            </wp:positionH>
+            <wp:positionV relativeFrom="paragraph">
+              <wp:posOffset>2366327</wp:posOffset>
+            </wp:positionV>
+            <wp:extent cx="1799590" cy="1799590"/>
+            <wp:effectExtent l="0" t="0" r="0" b="0"/>
+            <wp:wrapNone/>
+            <wp:docPr id="1620741190" name="Picture 5" descr="The image shows a black and white patterned background with a simple, abstract geometric design featuring black and white blocks and lines.&#10;&#10;AI-generated content may be incorrect."/>
+            <wp:cNvGraphicFramePr>
+              <a:graphicFrameLocks xmlns:a="http://schemas.openxmlformats.org/drawingml/2006/main" noChangeAspect="1"/>
+            </wp:cNvGraphicFramePr>
+            <a:graphic xmlns:a="http://schemas.openxmlformats.org/drawingml/2006/main">
+              <a:graphicData uri="http://schemas.openxmlformats.org/drawingml/2006/picture">
+                <pic:pic xmlns:pic="http://schemas.openxmlformats.org/drawingml/2006/picture">
+                  <pic:nvPicPr>
+                    <pic:cNvPr id="1620741190" name="Picture 5" descr="The image shows a black and white patterned background with a simple, abstract geometric design featuring black and white blocks and lines.&#10;&#10;AI-generated content may be incorrect."/>
+                    <pic:cNvPicPr/>
+                  </pic:nvPicPr>
+                  <pic:blipFill>
+                    <a:blip r:embed="rId5">
                       <a:extLst>
                         <a:ext uri="{28A0092B-C50C-407E-A947-70E740481C1C}">
                           <a14:useLocalDpi xmlns:a14="http://schemas.microsoft.com/office/drawing/2010/main" val="0"/>
@@ -248,18 +458,18 @@
           <w:noProof/>
         </w:rPr>
         <w:drawing>
-          <wp:anchor distT="0" distB="0" distL="114300" distR="114300" simplePos="0" relativeHeight="251658240" behindDoc="0" locked="0" layoutInCell="1" allowOverlap="1" wp14:anchorId="45D0C538" wp14:editId="54A5DA74">
+          <wp:anchor distT="0" distB="0" distL="114300" distR="114300" simplePos="0" relativeHeight="251659264" behindDoc="0" locked="0" layoutInCell="1" allowOverlap="1" wp14:anchorId="70C24CCD" wp14:editId="03E58F84">
             <wp:simplePos x="0" y="0"/>
             <wp:positionH relativeFrom="column">
-              <wp:posOffset>3642995</wp:posOffset>
+              <wp:posOffset>-385762</wp:posOffset>
             </wp:positionH>
             <wp:positionV relativeFrom="paragraph">
-              <wp:posOffset>6253162</wp:posOffset>
+              <wp:posOffset>2442210</wp:posOffset>
             </wp:positionV>
             <wp:extent cx="1799590" cy="1799590"/>
             <wp:effectExtent l="0" t="0" r="0" b="0"/>
             <wp:wrapNone/>
-            <wp:docPr id="1620741190" name="Picture 5" descr="The image shows a black and white patterned background with a simple, abstract geometric design featuring black and white blocks and lines.&#10;&#10;AI-generated content may be incorrect."/>
+            <wp:docPr id="1782883457" name="Picture 4" descr="The image is a black and white pattern with a simple, pixelated, checkered design.&#10;&#10;AI-generated content may be incorrect."/>
             <wp:cNvGraphicFramePr>
               <a:graphicFrameLocks xmlns:a="http://schemas.openxmlformats.org/drawingml/2006/main" noChangeAspect="1"/>
             </wp:cNvGraphicFramePr>
@@ -267,11 +477,191 @@
               <a:graphicData uri="http://schemas.openxmlformats.org/drawingml/2006/picture">
                 <pic:pic xmlns:pic="http://schemas.openxmlformats.org/drawingml/2006/picture">
                   <pic:nvPicPr>
-                    <pic:cNvPr id="1620741190" name="Picture 5" descr="The image shows a black and white patterned background with a simple, abstract geometric design featuring black and white blocks and lines.&#10;&#10;AI-generated content may be incorrect."/>
+                    <pic:cNvPr id="1782883457" name="Picture 4" descr="The image is a black and white pattern with a simple, pixelated, checkered design.&#10;&#10;AI-generated content may be incorrect."/>
                     <pic:cNvPicPr/>
                   </pic:nvPicPr>
                   <pic:blipFill>
                     <a:blip r:embed="rId8">
+                      <a:extLst>
+                        <a:ext uri="{28A0092B-C50C-407E-A947-70E740481C1C}">
+                          <a14:useLocalDpi xmlns:a14="http://schemas.microsoft.com/office/drawing/2010/main" val="0"/>
+                        </a:ext>
+                      </a:extLst>
+                    </a:blip>
+                    <a:stretch>
+                      <a:fillRect/>
+                    </a:stretch>
+                  </pic:blipFill>
+                  <pic:spPr>
+                    <a:xfrm>
+                      <a:off x="0" y="0"/>
+                      <a:ext cx="1799590" cy="1799590"/>
+                    </a:xfrm>
+                    <a:prstGeom prst="rect">
+                      <a:avLst/>
+                    </a:prstGeom>
+                  </pic:spPr>
+                </pic:pic>
+              </a:graphicData>
+            </a:graphic>
+            <wp14:sizeRelH relativeFrom="page">
+              <wp14:pctWidth>0</wp14:pctWidth>
+            </wp14:sizeRelH>
+            <wp14:sizeRelV relativeFrom="page">
+              <wp14:pctHeight>0</wp14:pctHeight>
+            </wp14:sizeRelV>
+          </wp:anchor>
+        </w:drawing>
+      </w:r>
+      <w:r>
+        <w:rPr>
+          <w:noProof/>
+        </w:rPr>
+        <w:drawing>
+          <wp:anchor distT="0" distB="0" distL="114300" distR="114300" simplePos="0" relativeHeight="251660288" behindDoc="0" locked="0" layoutInCell="1" allowOverlap="1" wp14:anchorId="27B18FF7" wp14:editId="4BC73459">
+            <wp:simplePos x="0" y="0"/>
+            <wp:positionH relativeFrom="column">
+              <wp:posOffset>4385310</wp:posOffset>
+            </wp:positionH>
+            <wp:positionV relativeFrom="paragraph">
+              <wp:posOffset>-609917</wp:posOffset>
+            </wp:positionV>
+            <wp:extent cx="1799590" cy="1799590"/>
+            <wp:effectExtent l="0" t="0" r="0" b="0"/>
+            <wp:wrapNone/>
+            <wp:docPr id="1347578689" name="Picture 3" descr="i&#10;&#10;AI-generated content may be incorrect."/>
+            <wp:cNvGraphicFramePr>
+              <a:graphicFrameLocks xmlns:a="http://schemas.openxmlformats.org/drawingml/2006/main" noChangeAspect="1"/>
+            </wp:cNvGraphicFramePr>
+            <a:graphic xmlns:a="http://schemas.openxmlformats.org/drawingml/2006/main">
+              <a:graphicData uri="http://schemas.openxmlformats.org/drawingml/2006/picture">
+                <pic:pic xmlns:pic="http://schemas.openxmlformats.org/drawingml/2006/picture">
+                  <pic:nvPicPr>
+                    <pic:cNvPr id="1347578689" name="Picture 3" descr="i&#10;&#10;AI-generated content may be incorrect."/>
+                    <pic:cNvPicPr/>
+                  </pic:nvPicPr>
+                  <pic:blipFill>
+                    <a:blip r:embed="rId9">
+                      <a:extLst>
+                        <a:ext uri="{28A0092B-C50C-407E-A947-70E740481C1C}">
+                          <a14:useLocalDpi xmlns:a14="http://schemas.microsoft.com/office/drawing/2010/main" val="0"/>
+                        </a:ext>
+                      </a:extLst>
+                    </a:blip>
+                    <a:stretch>
+                      <a:fillRect/>
+                    </a:stretch>
+                  </pic:blipFill>
+                  <pic:spPr>
+                    <a:xfrm>
+                      <a:off x="0" y="0"/>
+                      <a:ext cx="1799590" cy="1799590"/>
+                    </a:xfrm>
+                    <a:prstGeom prst="rect">
+                      <a:avLst/>
+                    </a:prstGeom>
+                  </pic:spPr>
+                </pic:pic>
+              </a:graphicData>
+            </a:graphic>
+            <wp14:sizeRelH relativeFrom="page">
+              <wp14:pctWidth>0</wp14:pctWidth>
+            </wp14:sizeRelH>
+            <wp14:sizeRelV relativeFrom="page">
+              <wp14:pctHeight>0</wp14:pctHeight>
+            </wp14:sizeRelV>
+          </wp:anchor>
+        </w:drawing>
+      </w:r>
+      <w:r>
+        <w:rPr>
+          <w:noProof/>
+        </w:rPr>
+        <w:drawing>
+          <wp:anchor distT="0" distB="0" distL="114300" distR="114300" simplePos="0" relativeHeight="251661312" behindDoc="0" locked="0" layoutInCell="1" allowOverlap="1" wp14:anchorId="1DB10A86" wp14:editId="3D86D54E">
+            <wp:simplePos x="0" y="0"/>
+            <wp:positionH relativeFrom="column">
+              <wp:posOffset>1995170</wp:posOffset>
+            </wp:positionH>
+            <wp:positionV relativeFrom="paragraph">
+              <wp:posOffset>-548322</wp:posOffset>
+            </wp:positionV>
+            <wp:extent cx="1799590" cy="1799590"/>
+            <wp:effectExtent l="0" t="0" r="0" b="0"/>
+            <wp:wrapNone/>
+            <wp:docPr id="488119219" name="Picture 2" descr="The image appears to be a black and white pattern with a series of geometric shapes or pixels that may suggest a digital or abstract design.&#10;&#10;AI-generated content may be incorrect."/>
+            <wp:cNvGraphicFramePr>
+              <a:graphicFrameLocks xmlns:a="http://schemas.openxmlformats.org/drawingml/2006/main" noChangeAspect="1"/>
+            </wp:cNvGraphicFramePr>
+            <a:graphic xmlns:a="http://schemas.openxmlformats.org/drawingml/2006/main">
+              <a:graphicData uri="http://schemas.openxmlformats.org/drawingml/2006/picture">
+                <pic:pic xmlns:pic="http://schemas.openxmlformats.org/drawingml/2006/picture">
+                  <pic:nvPicPr>
+                    <pic:cNvPr id="488119219" name="Picture 2" descr="The image appears to be a black and white pattern with a series of geometric shapes or pixels that may suggest a digital or abstract design.&#10;&#10;AI-generated content may be incorrect."/>
+                    <pic:cNvPicPr/>
+                  </pic:nvPicPr>
+                  <pic:blipFill>
+                    <a:blip r:embed="rId10">
+                      <a:extLst>
+                        <a:ext uri="{28A0092B-C50C-407E-A947-70E740481C1C}">
+                          <a14:useLocalDpi xmlns:a14="http://schemas.microsoft.com/office/drawing/2010/main" val="0"/>
+                        </a:ext>
+                      </a:extLst>
+                    </a:blip>
+                    <a:stretch>
+                      <a:fillRect/>
+                    </a:stretch>
+                  </pic:blipFill>
+                  <pic:spPr>
+                    <a:xfrm>
+                      <a:off x="0" y="0"/>
+                      <a:ext cx="1799590" cy="1799590"/>
+                    </a:xfrm>
+                    <a:prstGeom prst="rect">
+                      <a:avLst/>
+                    </a:prstGeom>
+                  </pic:spPr>
+                </pic:pic>
+              </a:graphicData>
+            </a:graphic>
+            <wp14:sizeRelH relativeFrom="page">
+              <wp14:pctWidth>0</wp14:pctWidth>
+            </wp14:sizeRelH>
+            <wp14:sizeRelV relativeFrom="page">
+              <wp14:pctHeight>0</wp14:pctHeight>
+            </wp14:sizeRelV>
+          </wp:anchor>
+        </w:drawing>
+      </w:r>
+      <w:r>
+        <w:rPr>
+          <w:noProof/>
+        </w:rPr>
+        <w:drawing>
+          <wp:anchor distT="0" distB="0" distL="114300" distR="114300" simplePos="0" relativeHeight="251662336" behindDoc="1" locked="0" layoutInCell="1" allowOverlap="1" wp14:anchorId="0F6F0981" wp14:editId="0077A71E">
+            <wp:simplePos x="0" y="0"/>
+            <wp:positionH relativeFrom="column">
+              <wp:posOffset>-409575</wp:posOffset>
+            </wp:positionH>
+            <wp:positionV relativeFrom="paragraph">
+              <wp:posOffset>-552450</wp:posOffset>
+            </wp:positionV>
+            <wp:extent cx="1799590" cy="1799590"/>
+            <wp:effectExtent l="0" t="0" r="0" b="0"/>
+            <wp:wrapNone/>
+            <wp:docPr id="1710969230" name="Picture 1" descr="The image depicts a stark, minimalistic design with black and white geometric shapes arranged in a fragmented, abstract pattern.&#10;&#10;AI-generated content may be incorrect."/>
+            <wp:cNvGraphicFramePr>
+              <a:graphicFrameLocks xmlns:a="http://schemas.openxmlformats.org/drawingml/2006/main" noChangeAspect="1"/>
+            </wp:cNvGraphicFramePr>
+            <a:graphic xmlns:a="http://schemas.openxmlformats.org/drawingml/2006/main">
+              <a:graphicData uri="http://schemas.openxmlformats.org/drawingml/2006/picture">
+                <pic:pic xmlns:pic="http://schemas.openxmlformats.org/drawingml/2006/picture">
+                  <pic:nvPicPr>
+                    <pic:cNvPr id="1710969230" name="Picture 1" descr="The image depicts a stark, minimalistic design with black and white geometric shapes arranged in a fragmented, abstract pattern.&#10;&#10;AI-generated content may be incorrect."/>
+                    <pic:cNvPicPr/>
+                  </pic:nvPicPr>
+                  <pic:blipFill>
+                    <a:blip r:embed="rId11">
                       <a:extLst>
                         <a:ext uri="{28A0092B-C50C-407E-A947-70E740481C1C}">
                           <a14:useLocalDpi xmlns:a14="http://schemas.microsoft.com/office/drawing/2010/main" val="0"/>

</xml_diff>